<commit_message>
rebrand: replace StrideX Institute / Wadhawaniya & Co. with SHAILESH-AI
Course is now presented as A SHAILESH-AI Program — AI Training &
Consulting, across brand.json, the README, and all 3 rebuilt
deliverables.
</commit_message>
<xml_diff>
--- a/Vibe_Coding_Student_Book.docx
+++ b/Vibe_Coding_Student_Book.docx
@@ -95,7 +95,7 @@
           <w:color w:val="5D6D7E"/>
           <w:sz w:val="20"/>
         </w:rPr>
-        <w:t>A StrideX Institute Program, in partnership with Wadhawaniya &amp; Co.</w:t>
+        <w:t>A SHAILESH-AI Program — AI Training &amp; Consulting</w:t>
       </w:r>
     </w:p>
     <w:p/>
@@ -26225,7 +26225,7 @@
         <w:color w:val="5D6D7E"/>
         <w:sz w:val="18"/>
       </w:rPr>
-      <w:t>CA Shailesh S Wadhawaniya · StrideX Institute</w:t>
+      <w:t>CA Shailesh S Wadhawaniya · SHAILESH-AI</w:t>
     </w:r>
   </w:p>
 </w:ftr>

</xml_diff>

<commit_message>
rebrand: International faculty, AI Trainer & Consultant, full CA title, website
- Roles/bio now say "National & International" ICAI Faculty, not just National
- "AI Trainer" -> "AI Trainer & Consultant" in the credentials line
- "CA" abbreviation spelled out as "Chartered Accountant" (name + credentials)
- Dropped the "July 2021" qualification date from the CA credential
- Added shaileshai.qzz.io to contact info (cover line + About/Contact section)
</commit_message>
<xml_diff>
--- a/Vibe_Coding_Student_Book.docx
+++ b/Vibe_Coding_Student_Book.docx
@@ -48,7 +48,7 @@
           <w:color w:val="1C2833"/>
           <w:sz w:val="36"/>
         </w:rPr>
-        <w:t>CA Shailesh S Wadhawaniya</w:t>
+        <w:t>Chartered Accountant Shailesh S Wadhawaniya</w:t>
       </w:r>
     </w:p>
     <w:p>
@@ -63,7 +63,7 @@
           <w:color w:val="5D6D7E"/>
           <w:sz w:val="22"/>
         </w:rPr>
-        <w:t>Chartered Accountant · AI Trainer · ESG Consultant · CPA(US) Educator</w:t>
+        <w:t>Chartered Accountant · AI Trainer &amp; Consultant · ESG Consultant · CPA(US) Educator</w:t>
       </w:r>
     </w:p>
     <w:p/>
@@ -139,7 +139,7 @@
           <w:color w:val="1C2833"/>
           <w:sz w:val="28"/>
         </w:rPr>
-        <w:t>CA Shailesh S Wadhawaniya</w:t>
+        <w:t>Chartered Accountant Shailesh S Wadhawaniya</w:t>
       </w:r>
     </w:p>
     <w:p>
@@ -151,7 +151,7 @@
           <w:color w:val="5D6D7E"/>
           <w:sz w:val="22"/>
         </w:rPr>
-        <w:t>Chartered Accountant · AI Trainer · ESG Consultant · CPA(US) Educator</w:t>
+        <w:t>Chartered Accountant · AI Trainer &amp; Consultant · ESG Consultant · CPA(US) Educator</w:t>
       </w:r>
     </w:p>
     <w:p/>
@@ -26225,7 +26225,7 @@
         <w:color w:val="5D6D7E"/>
         <w:sz w:val="18"/>
       </w:rPr>
-      <w:t>CA Shailesh S Wadhawaniya · SHAILESH-AI</w:t>
+      <w:t>Chartered Accountant Shailesh S Wadhawaniya · SHAILESH-AI</w:t>
     </w:r>
   </w:p>
 </w:ftr>

</xml_diff>